<commit_message>
week03: 박종진 체크리스트 v0.1로 URDF·MJCF 점검 (OK 30·NG 1·N-A 5), URDF <mujoco> 확장 추가, 보고서 팀 연계 100 %
</commit_message>
<xml_diff>
--- a/reports/학부생_주간활동보고서_3주차_함태훈_22212334_261008.docx
+++ b/reports/학부생_주간활동보고서_3주차_함태훈_22212334_261008.docx
@@ -1068,7 +1068,7 @@
               <w:rPr>
                 <w:sz w:val="16"/>
               </w:rPr>
-              <w:t>그림 1장(8단계, Isaac Sim 경로 점선). 체크리스트 제안 8항목 전달, 초안 수령 후 점검 예정.</w:t>
+              <w:t>그림 1장(8단계). 대응표 전달→박종진 체크리스트 v0.1로 내 URDF·MJCF 36항목 점검(스크립트): OK 30·NG 1(armature, BOM 대기)·N-A 5. 피드백 4건 회신.</w:t>
             </w:r>
           </w:p>
         </w:tc>
@@ -1098,7 +1098,7 @@
               <w:rPr>
                 <w:sz w:val="16"/>
               </w:rPr>
-              <w:t>80 %</w:t>
+              <w:t>100 %</w:t>
             </w:r>
           </w:p>
         </w:tc>
@@ -1128,7 +1128,7 @@
                 <w:rFonts w:hint="eastAsia"/>
                 <w:sz w:val="16"/>
               </w:rPr>
-              <w:t>docs/pipeline_cad_urdf_mjcf.png, notes/07 §5 · week03</w:t>
+              <w:t>docs/pipeline_cad_urdf_mjcf.png, notes/07 §6 · week03</w:t>
             </w:r>
             <w:proofErr w:type="spellStart"/>
             <w:proofErr w:type="spellEnd"/>

</xml_diff>